<commit_message>
Auto stash before merge of "dev" and "origin/dev"
Done print preview Rajal Dokter Perawat
</commit_message>
<xml_diff>
--- a/public/doc/emr/print_rajal_dewasa_dokter.docx
+++ b/public/doc/emr/print_rajal_dewasa_dokter.docx
@@ -138,7 +138,23 @@
                 <w:b/>
                 <w:szCs w:val="16"/>
               </w:rPr>
-              <w:t>Jl. Mayor Sunaryo No.37, Jetis, Sukoharjo 57512 Telp (0271) 593979</w:t>
+              <w:t xml:space="preserve">Jl. Mayor Sunaryo No.37, Jetis, </w:t>
+            </w:r>
+            <w:proofErr w:type="spellStart"/>
+            <w:r>
+              <w:rPr>
+                <w:b/>
+                <w:szCs w:val="16"/>
+              </w:rPr>
+              <w:t>Sukoharjo</w:t>
+            </w:r>
+            <w:proofErr w:type="spellEnd"/>
+            <w:r>
+              <w:rPr>
+                <w:b/>
+                <w:szCs w:val="16"/>
+              </w:rPr>
+              <w:t xml:space="preserve"> 57512 Telp (0271) 593979</w:t>
             </w:r>
             <w:r>
               <w:rPr>
@@ -147,12 +163,21 @@
               </w:rPr>
               <w:br/>
             </w:r>
+            <w:proofErr w:type="gramStart"/>
             <w:r>
               <w:rPr>
                 <w:b/>
                 <w:szCs w:val="16"/>
               </w:rPr>
-              <w:t xml:space="preserve">E-Mail : </w:t>
+              <w:t>E-Mail :</w:t>
+            </w:r>
+            <w:proofErr w:type="gramEnd"/>
+            <w:r>
+              <w:rPr>
+                <w:b/>
+                <w:szCs w:val="16"/>
+              </w:rPr>
+              <w:t xml:space="preserve"> </w:t>
             </w:r>
             <w:hyperlink r:id="rId9" w:history="1">
               <w:r>
@@ -171,7 +196,23 @@
                 <w:b/>
                 <w:szCs w:val="16"/>
               </w:rPr>
-              <w:t xml:space="preserve"> Website : </w:t>
+              <w:t xml:space="preserve"> </w:t>
+            </w:r>
+            <w:proofErr w:type="gramStart"/>
+            <w:r>
+              <w:rPr>
+                <w:b/>
+                <w:szCs w:val="16"/>
+              </w:rPr>
+              <w:t>Website :</w:t>
+            </w:r>
+            <w:proofErr w:type="gramEnd"/>
+            <w:r>
+              <w:rPr>
+                <w:b/>
+                <w:szCs w:val="16"/>
+              </w:rPr>
+              <w:t xml:space="preserve"> </w:t>
             </w:r>
             <w:hyperlink r:id="rId10" w:history="1">
               <w:r>
@@ -478,7 +519,7 @@
           <w:tcPr>
             <w:tcW w:w="11307" w:type="dxa"/>
             <w:gridSpan w:val="5"/>
-            <w:shd w:val="clear" w:color="auto" w:fill="007434"/>
+            <w:shd w:val="clear" w:color="auto" w:fill="006DCC"/>
           </w:tcPr>
           <w:p>
             <w:pPr>
@@ -548,14 +589,21 @@
                 <w:lang w:val="en-ID"/>
               </w:rPr>
             </w:pPr>
+            <w:proofErr w:type="spellStart"/>
+            <w:proofErr w:type="gramStart"/>
             <w:r>
               <w:t>Tanggal</w:t>
             </w:r>
+            <w:proofErr w:type="spellEnd"/>
             <w:r>
               <w:t xml:space="preserve"> </w:t>
             </w:r>
             <w:r>
-              <w:t xml:space="preserve">: </w:t>
+              <w:t>:</w:t>
+            </w:r>
+            <w:proofErr w:type="gramEnd"/>
+            <w:r>
+              <w:t xml:space="preserve"> </w:t>
             </w:r>
             <w:r>
               <w:rPr>
@@ -597,6 +645,7 @@
                 <w:lang w:val="en-ID"/>
               </w:rPr>
             </w:pPr>
+            <w:proofErr w:type="gramStart"/>
             <w:r>
               <w:t>Jam</w:t>
             </w:r>
@@ -604,7 +653,11 @@
               <w:t xml:space="preserve"> </w:t>
             </w:r>
             <w:r>
-              <w:t xml:space="preserve">: </w:t>
+              <w:t>:</w:t>
+            </w:r>
+            <w:proofErr w:type="gramEnd"/>
+            <w:r>
+              <w:t xml:space="preserve"> </w:t>
             </w:r>
             <w:r>
               <w:rPr>
@@ -735,8 +788,13 @@
             <w:tcW w:w="2426" w:type="dxa"/>
           </w:tcPr>
           <w:p>
-            <w:r>
-              <w:t>Keluhan Utama</w:t>
+            <w:proofErr w:type="spellStart"/>
+            <w:r>
+              <w:t>Keluhan</w:t>
+            </w:r>
+            <w:proofErr w:type="spellEnd"/>
+            <w:r>
+              <w:t xml:space="preserve"> Utama</w:t>
             </w:r>
           </w:p>
         </w:tc>
@@ -781,8 +839,21 @@
           </w:tcPr>
           <w:p>
             <w:r>
-              <w:t>Riwayat Penyakit Sekarang</w:t>
-            </w:r>
+              <w:t xml:space="preserve">Riwayat </w:t>
+            </w:r>
+            <w:proofErr w:type="spellStart"/>
+            <w:r>
+              <w:t>Penyakit</w:t>
+            </w:r>
+            <w:proofErr w:type="spellEnd"/>
+            <w:r>
+              <w:t xml:space="preserve"> </w:t>
+            </w:r>
+            <w:proofErr w:type="spellStart"/>
+            <w:r>
+              <w:t>Sekarang</w:t>
+            </w:r>
+            <w:proofErr w:type="spellEnd"/>
           </w:p>
         </w:tc>
         <w:tc>
@@ -826,8 +897,21 @@
           </w:tcPr>
           <w:p>
             <w:r>
-              <w:t>Riwayat Penyakit Dahulu</w:t>
-            </w:r>
+              <w:t xml:space="preserve">Riwayat </w:t>
+            </w:r>
+            <w:proofErr w:type="spellStart"/>
+            <w:r>
+              <w:t>Penyakit</w:t>
+            </w:r>
+            <w:proofErr w:type="spellEnd"/>
+            <w:r>
+              <w:t xml:space="preserve"> </w:t>
+            </w:r>
+            <w:proofErr w:type="spellStart"/>
+            <w:r>
+              <w:t>Dahulu</w:t>
+            </w:r>
+            <w:proofErr w:type="spellEnd"/>
           </w:p>
         </w:tc>
         <w:tc>
@@ -871,8 +955,21 @@
           </w:tcPr>
           <w:p>
             <w:r>
-              <w:t>Riwayat Penyakit Keluarga</w:t>
-            </w:r>
+              <w:t xml:space="preserve">Riwayat </w:t>
+            </w:r>
+            <w:proofErr w:type="spellStart"/>
+            <w:r>
+              <w:t>Penyakit</w:t>
+            </w:r>
+            <w:proofErr w:type="spellEnd"/>
+            <w:r>
+              <w:t xml:space="preserve"> </w:t>
+            </w:r>
+            <w:proofErr w:type="spellStart"/>
+            <w:r>
+              <w:t>Keluarga</w:t>
+            </w:r>
+            <w:proofErr w:type="spellEnd"/>
           </w:p>
         </w:tc>
         <w:tc>
@@ -940,8 +1037,13 @@
             <w:tcW w:w="2802" w:type="dxa"/>
           </w:tcPr>
           <w:p>
-            <w:r>
-              <w:t>Keadaan Umum</w:t>
+            <w:proofErr w:type="spellStart"/>
+            <w:r>
+              <w:t>Keadaan</w:t>
+            </w:r>
+            <w:proofErr w:type="spellEnd"/>
+            <w:r>
+              <w:t xml:space="preserve"> Umum</w:t>
             </w:r>
           </w:p>
         </w:tc>
@@ -976,8 +1078,13 @@
             <w:tcW w:w="2802" w:type="dxa"/>
           </w:tcPr>
           <w:p>
-            <w:r>
-              <w:t>Tekanan Darah</w:t>
+            <w:proofErr w:type="spellStart"/>
+            <w:r>
+              <w:t>Tekanan</w:t>
+            </w:r>
+            <w:proofErr w:type="spellEnd"/>
+            <w:r>
+              <w:t xml:space="preserve"> Darah</w:t>
             </w:r>
           </w:p>
         </w:tc>
@@ -1017,8 +1124,13 @@
             <w:pPr>
               <w:ind w:right="-105"/>
             </w:pPr>
-            <w:r>
-              <w:t>Saturasi O</w:t>
+            <w:proofErr w:type="spellStart"/>
+            <w:r>
+              <w:t>Saturasi</w:t>
+            </w:r>
+            <w:proofErr w:type="spellEnd"/>
+            <w:r>
+              <w:t xml:space="preserve"> O</w:t>
             </w:r>
             <w:r>
               <w:rPr>
@@ -1059,8 +1171,13 @@
             <w:tcW w:w="2802" w:type="dxa"/>
           </w:tcPr>
           <w:p>
-            <w:r>
-              <w:t>Frekuensi Nadi</w:t>
+            <w:proofErr w:type="spellStart"/>
+            <w:r>
+              <w:t>Frekuensi</w:t>
+            </w:r>
+            <w:proofErr w:type="spellEnd"/>
+            <w:r>
+              <w:t xml:space="preserve"> Nadi</w:t>
             </w:r>
           </w:p>
         </w:tc>
@@ -1135,8 +1252,13 @@
             <w:tcW w:w="2802" w:type="dxa"/>
           </w:tcPr>
           <w:p>
-            <w:r>
-              <w:t>Frekuensi Nafas</w:t>
+            <w:proofErr w:type="spellStart"/>
+            <w:r>
+              <w:t>Frekuensi</w:t>
+            </w:r>
+            <w:proofErr w:type="spellEnd"/>
+            <w:r>
+              <w:t xml:space="preserve"> Nafas</w:t>
             </w:r>
           </w:p>
         </w:tc>
@@ -1211,9 +1333,11 @@
             <w:tcW w:w="2802" w:type="dxa"/>
           </w:tcPr>
           <w:p>
+            <w:proofErr w:type="spellStart"/>
             <w:r>
               <w:t>Suhu</w:t>
             </w:r>
+            <w:proofErr w:type="spellEnd"/>
           </w:p>
         </w:tc>
         <w:tc>
@@ -1379,8 +1503,13 @@
           </w:tcPr>
           <w:p>
             <w:r>
-              <w:t>Hasil Laboratorium</w:t>
-            </w:r>
+              <w:t xml:space="preserve">Hasil </w:t>
+            </w:r>
+            <w:proofErr w:type="spellStart"/>
+            <w:r>
+              <w:t>Laboratorium</w:t>
+            </w:r>
+            <w:proofErr w:type="spellEnd"/>
           </w:p>
         </w:tc>
         <w:tc>
@@ -1419,8 +1548,13 @@
           </w:tcPr>
           <w:p>
             <w:r>
-              <w:t>Hasil Radiologi</w:t>
-            </w:r>
+              <w:t xml:space="preserve">Hasil </w:t>
+            </w:r>
+            <w:proofErr w:type="spellStart"/>
+            <w:r>
+              <w:t>Radiologi</w:t>
+            </w:r>
+            <w:proofErr w:type="spellEnd"/>
           </w:p>
         </w:tc>
         <w:tc>
@@ -1741,19 +1875,7 @@
               <w:rPr>
                 <w:sz w:val="17"/>
               </w:rPr>
-              <w:t>}</w:t>
-            </w:r>
-            <w:r>
-              <w:rPr>
-                <w:sz w:val="17"/>
-              </w:rPr>
-              <w:t xml:space="preserve"> </w:t>
-            </w:r>
-            <w:r>
-              <w:rPr>
-                <w:sz w:val="17"/>
-              </w:rPr>
-              <w:t>${</w:t>
+              <w:t>} ${</w:t>
             </w:r>
             <w:r>
               <w:rPr>
@@ -1905,8 +2027,33 @@
                 <w:b/>
                 <w:bCs/>
               </w:rPr>
-              <w:t>Yang Melakukan Pengkajian</w:t>
-            </w:r>
+              <w:t xml:space="preserve">Yang </w:t>
+            </w:r>
+            <w:proofErr w:type="spellStart"/>
+            <w:r>
+              <w:rPr>
+                <w:b/>
+                <w:bCs/>
+              </w:rPr>
+              <w:t>Melakukan</w:t>
+            </w:r>
+            <w:proofErr w:type="spellEnd"/>
+            <w:r>
+              <w:rPr>
+                <w:b/>
+                <w:bCs/>
+              </w:rPr>
+              <w:t xml:space="preserve"> </w:t>
+            </w:r>
+            <w:proofErr w:type="spellStart"/>
+            <w:r>
+              <w:rPr>
+                <w:b/>
+                <w:bCs/>
+              </w:rPr>
+              <w:t>Pengkajian</w:t>
+            </w:r>
+            <w:proofErr w:type="spellEnd"/>
           </w:p>
           <w:p>
             <w:pPr>
@@ -1953,6 +2100,7 @@
             <w:pPr>
               <w:jc w:val="center"/>
             </w:pPr>
+            <w:proofErr w:type="gramStart"/>
             <w:r>
               <w:t xml:space="preserve">( </w:t>
             </w:r>
@@ -1960,7 +2108,14 @@
               <w:rPr>
                 <w:u w:val="single"/>
               </w:rPr>
-              <w:t>${</w:t>
+              <w:t>$</w:t>
+            </w:r>
+            <w:proofErr w:type="gramEnd"/>
+            <w:r>
+              <w:rPr>
+                <w:u w:val="single"/>
+              </w:rPr>
+              <w:t>{</w:t>
             </w:r>
             <w:r>
               <w:rPr>
@@ -1969,6 +2124,7 @@
               </w:rPr>
               <w:t>FINALISASI_OLEH</w:t>
             </w:r>
+            <w:proofErr w:type="gramStart"/>
             <w:r>
               <w:rPr>
                 <w:u w:val="single"/>
@@ -1978,6 +2134,7 @@
             <w:r>
               <w:t xml:space="preserve"> )</w:t>
             </w:r>
+            <w:proofErr w:type="gramEnd"/>
           </w:p>
           <w:p>
             <w:pPr>
@@ -1992,8 +2149,18 @@
                 <w:szCs w:val="18"/>
                 <w:lang w:val="en-ID"/>
               </w:rPr>
-              <w:t>Tanda Tangan dan Nama Lengkap</w:t>
-            </w:r>
+              <w:t xml:space="preserve">Tanda Tangan dan Nama </w:t>
+            </w:r>
+            <w:proofErr w:type="spellStart"/>
+            <w:r>
+              <w:rPr>
+                <w:sz w:val="14"/>
+                <w:szCs w:val="18"/>
+                <w:lang w:val="en-ID"/>
+              </w:rPr>
+              <w:t>Lengkap</w:t>
+            </w:r>
+            <w:proofErr w:type="spellEnd"/>
           </w:p>
         </w:tc>
       </w:tr>
@@ -2051,6 +2218,7 @@
         <w:lang w:val="en-ID"/>
       </w:rPr>
     </w:pPr>
+    <w:proofErr w:type="spellStart"/>
     <w:r>
       <w:rPr>
         <w:i/>
@@ -2058,7 +2226,57 @@
         <w:sz w:val="16"/>
         <w:szCs w:val="20"/>
       </w:rPr>
-      <w:t>Formulir ini dicetak pada ${</w:t>
+      <w:t>Formulir</w:t>
+    </w:r>
+    <w:proofErr w:type="spellEnd"/>
+    <w:r>
+      <w:rPr>
+        <w:i/>
+        <w:iCs/>
+        <w:sz w:val="16"/>
+        <w:szCs w:val="20"/>
+      </w:rPr>
+      <w:t xml:space="preserve"> </w:t>
+    </w:r>
+    <w:proofErr w:type="spellStart"/>
+    <w:r>
+      <w:rPr>
+        <w:i/>
+        <w:iCs/>
+        <w:sz w:val="16"/>
+        <w:szCs w:val="20"/>
+      </w:rPr>
+      <w:t>ini</w:t>
+    </w:r>
+    <w:proofErr w:type="spellEnd"/>
+    <w:r>
+      <w:rPr>
+        <w:i/>
+        <w:iCs/>
+        <w:sz w:val="16"/>
+        <w:szCs w:val="20"/>
+      </w:rPr>
+      <w:t xml:space="preserve"> </w:t>
+    </w:r>
+    <w:proofErr w:type="spellStart"/>
+    <w:r>
+      <w:rPr>
+        <w:i/>
+        <w:iCs/>
+        <w:sz w:val="16"/>
+        <w:szCs w:val="20"/>
+      </w:rPr>
+      <w:t>dicetak</w:t>
+    </w:r>
+    <w:proofErr w:type="spellEnd"/>
+    <w:r>
+      <w:rPr>
+        <w:i/>
+        <w:iCs/>
+        <w:sz w:val="16"/>
+        <w:szCs w:val="20"/>
+      </w:rPr>
+      <w:t xml:space="preserve"> pada ${</w:t>
     </w:r>
     <w:r>
       <w:rPr>

</xml_diff>